<commit_message>
DOCX: corrige a ordem dos elementos de formatação nos estilos de caixa
O Word exige pBdr antes de shd no estilo do parágrafo; a inserção estava invertida
nos estilos Aviso e Destaque. Também ajusta o id dos marcadores internos para um
contador sequencial (hash() variava entre execuções e quebrava o byte a byte).

Co-authored-by: arena-agent <297053741+arena-agent@users.noreply.github.com>
</commit_message>
<xml_diff>
--- a/material-de-estudo/base-de-conhecimento-funcao-sistemas.docx
+++ b/material-de-estudo/base-de-conhecimento-funcao-sistemas.docx
@@ -53071,10 +53071,10 @@
     <w:name w:val="Aviso"/>
     <w:basedOn w:val="Normal"/>
     <w:pPr>
-      <w:shd w:val="clear" w:color="auto" w:fill="FDF3E3"/>
       <w:pBdr>
         <w:left w:val="single" w:sz="18" w:space="6" w:color="B45309"/>
       </w:pBdr>
+      <w:shd w:val="clear" w:color="auto" w:fill="FDF3E3"/>
       <w:spacing w:before="80" w:after="80"/>
       <w:ind w:left="198" w:right="85"/>
     </w:pPr>
@@ -53086,10 +53086,10 @@
     <w:name w:val="Destaque"/>
     <w:basedOn w:val="Normal"/>
     <w:pPr>
-      <w:shd w:val="clear" w:color="auto" w:fill="EAF1F9"/>
       <w:pBdr>
         <w:left w:val="single" w:sz="18" w:space="6" w:color="1E5A92"/>
       </w:pBdr>
+      <w:shd w:val="clear" w:color="auto" w:fill="EAF1F9"/>
       <w:spacing w:before="80" w:after="80"/>
       <w:ind w:left="198" w:right="85"/>
     </w:pPr>

</xml_diff>